<commit_message>
TBCP: reconcile agreement register + exec summary governance names; final consistency 11/0/0
All 52 documents complete and internally consistent (parties, ownership, per-Active-
Subscriber payment, 20+2x5 term, order-of-precedence, shared definitions, cross-refs).

Co-Authored-By: Claude Opus 4.8 <noreply@anthropic.com>
Claude-Session: https://claude.ai/code/session_01NhaKeVxjNyTBn6poC6zJrZ
</commit_message>
<xml_diff>
--- a/Lumbee_RIVR_TBCP_Agreement_Package/00_START_HERE/01_Executive_Summary_and_Transaction_Structure.docx
+++ b/Lumbee_RIVR_TBCP_Agreement_Package/00_START_HERE/01_Executive_Summary_and_Transaction_Structure.docx
@@ -3018,7 +3018,7 @@
           <w:i/>
           <w:color w:val="595959"/>
         </w:rPr>
-        <w:t>Governance titles below are illustrative structural placeholders; exact instruments and content are subject to counsel confirmation.</w:t>
+        <w:t>The seven governance/authorization documents below correspond to the files in 03_Governance_Authorizations/; their content remains subject to counsel confirmation.</w:t>
       </w:r>
     </w:p>
     <w:tbl>
@@ -3103,7 +3103,7 @@
                 <w:i w:val="0"/>
                 <w:sz w:val="18"/>
               </w:rPr>
-              <w:t>Lumbee Tribal Council Authorizing Resolution (Award Acceptance, Transaction, and Signatory Authority)</w:t>
+              <w:t>Lumbee Tribal Council Resolution</w:t>
             </w:r>
           </w:p>
         </w:tc>
@@ -3139,7 +3139,7 @@
                 <w:i w:val="0"/>
                 <w:sz w:val="18"/>
               </w:rPr>
-              <w:t>RIVR Tech (LREMC Technologies, LLC) Member/Manager Consent and Authorization</w:t>
+              <w:t>RIVR Tech Member/Manager Authorization</w:t>
             </w:r>
           </w:p>
         </w:tc>
@@ -3173,7 +3173,7 @@
                 <w:i w:val="0"/>
                 <w:sz w:val="18"/>
               </w:rPr>
-              <w:t>LREMC Board Consent, Joinder, and Owner-Approval Authorization (LREMC Facilities)</w:t>
+              <w:t>LREMC Consent and Joinder</w:t>
             </w:r>
           </w:p>
         </w:tc>
@@ -3209,7 +3209,7 @@
                 <w:i w:val="0"/>
                 <w:sz w:val="18"/>
               </w:rPr>
-              <w:t>Limited Waiver of Sovereign Immunity and Consent to Dispute Resolution</w:t>
+              <w:t>Limited Waiver of Sovereign Immunity (bracketed alternatives — FOR COUNSEL)</w:t>
             </w:r>
           </w:p>
         </w:tc>
@@ -3243,7 +3243,7 @@
                 <w:i w:val="0"/>
                 <w:sz w:val="18"/>
               </w:rPr>
-              <w:t>Certificate of Authorized Signatories, Incumbency, and Corporate/Tribal Existence</w:t>
+              <w:t>Tax, TERO, Permitting, and Regulatory Schedule</w:t>
             </w:r>
           </w:p>
         </w:tc>
@@ -3279,7 +3279,7 @@
                 <w:i w:val="0"/>
                 <w:sz w:val="18"/>
               </w:rPr>
-              <w:t>NTIA/DOC Notice, Consent, and Written-Determination Request Log (Award, Precedence, and Characterization)</w:t>
+              <w:t>Insurance Schedule</w:t>
             </w:r>
           </w:p>
         </w:tc>
@@ -3313,7 +3313,7 @@
                 <w:i w:val="0"/>
                 <w:sz w:val="18"/>
               </w:rPr>
-              <w:t>Common-Interest, Confidentiality, and Attorney Work-Product Agreement</w:t>
+              <w:t>Service Level Schedule</w:t>
             </w:r>
           </w:p>
         </w:tc>

</xml_diff>